<commit_message>
Update documentation and project files
</commit_message>
<xml_diff>
--- a/docs/documentation technique.docx
+++ b/docs/documentation technique.docx
@@ -227,13 +227,8 @@
           <w:numId w:val="3"/>
         </w:numPr>
       </w:pPr>
-      <w:proofErr w:type="gramStart"/>
-      <w:r>
-        <w:t>Apache(</w:t>
-      </w:r>
-      <w:proofErr w:type="gramEnd"/>
-      <w:r>
-        <w:t xml:space="preserve">via </w:t>
+      <w:r>
+        <w:t xml:space="preserve">Apache(via </w:t>
       </w:r>
       <w:proofErr w:type="spellStart"/>
       <w:r>
@@ -294,13 +289,8 @@
           <w:numId w:val="4"/>
         </w:numPr>
       </w:pPr>
-      <w:proofErr w:type="gramStart"/>
-      <w:r>
-        <w:t>phpMyAdmin</w:t>
-      </w:r>
-      <w:proofErr w:type="gramEnd"/>
-      <w:r>
-        <w:t xml:space="preserve"> (administration)</w:t>
+      <w:r>
+        <w:t>phpMyAdmin (administration)</w:t>
       </w:r>
     </w:p>
     <w:p>
@@ -384,17 +374,12 @@
         </w:numPr>
       </w:pPr>
       <w:proofErr w:type="spellStart"/>
-      <w:proofErr w:type="gramStart"/>
       <w:r>
         <w:t>Mailpit</w:t>
       </w:r>
       <w:proofErr w:type="spellEnd"/>
       <w:r>
-        <w:t>(</w:t>
-      </w:r>
-      <w:proofErr w:type="gramEnd"/>
-      <w:r>
-        <w:t>Tests SMTP en local)</w:t>
+        <w:t>(Tests SMTP en local)</w:t>
       </w:r>
     </w:p>
     <w:p>
@@ -441,7 +426,6 @@
           <w:numId w:val="9"/>
         </w:numPr>
       </w:pPr>
-      <w:proofErr w:type="gramStart"/>
       <w:r>
         <w:t>Fichier .</w:t>
       </w:r>
@@ -450,7 +434,6 @@
         <w:t>env</w:t>
       </w:r>
       <w:proofErr w:type="spellEnd"/>
-      <w:proofErr w:type="gramEnd"/>
     </w:p>
     <w:p>
       <w:pPr>
@@ -604,7 +587,7 @@
           <w:noProof/>
         </w:rPr>
         <w:drawing>
-          <wp:inline distT="0" distB="0" distL="0" distR="0" wp14:anchorId="44DD6A95" wp14:editId="15B25969">
+          <wp:inline distT="0" distB="0" distL="0" distR="0" wp14:anchorId="44DD6A95" wp14:editId="7F0A772B">
             <wp:extent cx="5760720" cy="4380230"/>
             <wp:effectExtent l="0" t="0" r="0" b="1270"/>
             <wp:docPr id="2013273392" name="Image 1"/>
@@ -804,26 +787,18 @@
       </w:r>
     </w:p>
     <w:p>
-      <w:proofErr w:type="gramStart"/>
       <w:r>
         <w:t xml:space="preserve">l’utilisateur </w:t>
       </w:r>
       <w:r>
         <w:t>.</w:t>
       </w:r>
-      <w:proofErr w:type="gramEnd"/>
-    </w:p>
-    <w:p>
-      <w:proofErr w:type="gramStart"/>
-      <w:r>
-        <w:t>la</w:t>
-      </w:r>
-      <w:proofErr w:type="gramEnd"/>
-      <w:r>
-        <w:t xml:space="preserve"> page </w:t>
+    </w:p>
+    <w:p>
+      <w:r>
+        <w:t xml:space="preserve">la page </w:t>
       </w:r>
       <w:proofErr w:type="spellStart"/>
-      <w:proofErr w:type="gramStart"/>
       <w:r>
         <w:t>commande.php</w:t>
       </w:r>
@@ -834,34 +809,18 @@
       <w:r>
         <w:t>.</w:t>
       </w:r>
-      <w:proofErr w:type="gramEnd"/>
-    </w:p>
-    <w:p>
-      <w:proofErr w:type="gramStart"/>
-      <w:r>
-        <w:t>la</w:t>
-      </w:r>
-      <w:proofErr w:type="gramEnd"/>
-      <w:r>
-        <w:t xml:space="preserve"> base de </w:t>
-      </w:r>
-      <w:proofErr w:type="gramStart"/>
-      <w:r>
-        <w:t xml:space="preserve">données </w:t>
+    </w:p>
+    <w:p>
+      <w:r>
+        <w:t xml:space="preserve">la base de données </w:t>
       </w:r>
       <w:r>
         <w:t>.</w:t>
       </w:r>
-      <w:proofErr w:type="gramEnd"/>
-    </w:p>
-    <w:p>
-      <w:proofErr w:type="gramStart"/>
-      <w:r>
-        <w:t>le</w:t>
-      </w:r>
-      <w:proofErr w:type="gramEnd"/>
-      <w:r>
-        <w:t xml:space="preserve"> système d’envoi d’email.</w:t>
+    </w:p>
+    <w:p>
+      <w:r>
+        <w:t>le système d’envoi d’email.</w:t>
       </w:r>
     </w:p>
     <w:p>
@@ -871,7 +830,7 @@
         </w:rPr>
         <w:lastRenderedPageBreak/>
         <w:drawing>
-          <wp:inline distT="0" distB="0" distL="0" distR="0" wp14:anchorId="41964FDE" wp14:editId="6F330C95">
+          <wp:inline distT="0" distB="0" distL="0" distR="0" wp14:anchorId="41964FDE" wp14:editId="1D952DCB">
             <wp:extent cx="5760720" cy="4633595"/>
             <wp:effectExtent l="0" t="0" r="0" b="0"/>
             <wp:docPr id="925172548" name="Image 3"/>
@@ -920,6 +879,693 @@
         </w:drawing>
       </w:r>
     </w:p>
+    <w:p/>
+    <w:p>
+      <w:pPr>
+        <w:pStyle w:val="Titre2"/>
+      </w:pPr>
+      <w:r>
+        <w:t>Documentation du déploiement de l’application</w:t>
+      </w:r>
+    </w:p>
+    <w:p>
+      <w:r>
+        <w:t>L’objectif du déploiement était de rendre l’application Vite &amp; Gourmand accessible en ligne dans un environnement proche de la production tout en conservant le fonctionnement des bases de données et des services externes.</w:t>
+      </w:r>
+    </w:p>
+    <w:p>
+      <w:pPr>
+        <w:rPr>
+          <w:b/>
+          <w:bCs/>
+        </w:rPr>
+      </w:pPr>
+      <w:r>
+        <w:rPr>
+          <w:b/>
+          <w:bCs/>
+        </w:rPr>
+        <w:t>Hébergement de l’application</w:t>
+      </w:r>
+    </w:p>
+    <w:p>
+      <w:r>
+        <w:t xml:space="preserve">L’application a été déployée sur </w:t>
+      </w:r>
+      <w:proofErr w:type="spellStart"/>
+      <w:r>
+        <w:t>Heroku</w:t>
+      </w:r>
+      <w:proofErr w:type="spellEnd"/>
+      <w:r>
+        <w:t>.</w:t>
+      </w:r>
+    </w:p>
+    <w:p>
+      <w:r>
+        <w:t>Le projet PHP a été connecté à un dépôt GitHub afin de permettre le déploiement de l’application ainsi que la mise à jour du code.</w:t>
+      </w:r>
+    </w:p>
+    <w:p>
+      <w:r>
+        <w:t xml:space="preserve">Le service </w:t>
+      </w:r>
+      <w:proofErr w:type="spellStart"/>
+      <w:r>
+        <w:t>Heroku</w:t>
+      </w:r>
+      <w:proofErr w:type="spellEnd"/>
+      <w:r>
+        <w:t xml:space="preserve"> CLI a également été utilisé pour certaines opérations de configuration et de vérification du déploiement.</w:t>
+      </w:r>
+    </w:p>
+    <w:p>
+      <w:r>
+        <w:t>URL du projet :</w:t>
+      </w:r>
+    </w:p>
+    <w:p>
+      <w:hyperlink r:id="rId8" w:history="1">
+        <w:r>
+          <w:rPr>
+            <w:rStyle w:val="Lienhypertexte"/>
+          </w:rPr>
+          <w:t>https://ecf-vite-et-gourmand-0fe8020a4b1d.herokuapp.com/public/</w:t>
+        </w:r>
+      </w:hyperlink>
+    </w:p>
+    <w:p/>
+    <w:p>
+      <w:pPr>
+        <w:pStyle w:val="Titre2"/>
+      </w:pPr>
+      <w:r>
+        <w:lastRenderedPageBreak/>
+        <w:t>Base de données relationnelle</w:t>
+      </w:r>
+    </w:p>
+    <w:p>
+      <w:r>
+        <w:t xml:space="preserve">Pour l’environnement de production, j’ai utilisé </w:t>
+      </w:r>
+      <w:proofErr w:type="spellStart"/>
+      <w:r>
+        <w:t>JawsDB</w:t>
+      </w:r>
+      <w:proofErr w:type="spellEnd"/>
+      <w:r>
+        <w:t xml:space="preserve"> MySQL afin d’héberger la base de données distante.</w:t>
+      </w:r>
+    </w:p>
+    <w:p>
+      <w:r>
+        <w:t>Le fichier SQL du projet a été importé afin de restaurer les tables et les données nécessaires au fonctionnement du site.</w:t>
+      </w:r>
+    </w:p>
+    <w:p>
+      <w:pPr>
+        <w:pStyle w:val="Paragraphedeliste"/>
+        <w:numPr>
+          <w:ilvl w:val="0"/>
+          <w:numId w:val="17"/>
+        </w:numPr>
+      </w:pPr>
+      <w:r>
+        <w:t>Exemples de tables utilisées :</w:t>
+      </w:r>
+    </w:p>
+    <w:p>
+      <w:pPr>
+        <w:pStyle w:val="Paragraphedeliste"/>
+        <w:numPr>
+          <w:ilvl w:val="0"/>
+          <w:numId w:val="17"/>
+        </w:numPr>
+      </w:pPr>
+      <w:r>
+        <w:t xml:space="preserve">utilisateur </w:t>
+      </w:r>
+    </w:p>
+    <w:p>
+      <w:pPr>
+        <w:pStyle w:val="Paragraphedeliste"/>
+        <w:numPr>
+          <w:ilvl w:val="0"/>
+          <w:numId w:val="17"/>
+        </w:numPr>
+      </w:pPr>
+      <w:proofErr w:type="spellStart"/>
+      <w:r>
+        <w:t>role</w:t>
+      </w:r>
+      <w:proofErr w:type="spellEnd"/>
+      <w:r>
+        <w:t xml:space="preserve"> </w:t>
+      </w:r>
+    </w:p>
+    <w:p>
+      <w:pPr>
+        <w:pStyle w:val="Paragraphedeliste"/>
+        <w:numPr>
+          <w:ilvl w:val="0"/>
+          <w:numId w:val="17"/>
+        </w:numPr>
+      </w:pPr>
+      <w:r>
+        <w:t xml:space="preserve">menu </w:t>
+      </w:r>
+    </w:p>
+    <w:p>
+      <w:pPr>
+        <w:pStyle w:val="Paragraphedeliste"/>
+        <w:numPr>
+          <w:ilvl w:val="0"/>
+          <w:numId w:val="17"/>
+        </w:numPr>
+      </w:pPr>
+      <w:r>
+        <w:t xml:space="preserve">plat </w:t>
+      </w:r>
+    </w:p>
+    <w:p>
+      <w:pPr>
+        <w:pStyle w:val="Paragraphedeliste"/>
+        <w:numPr>
+          <w:ilvl w:val="0"/>
+          <w:numId w:val="17"/>
+        </w:numPr>
+      </w:pPr>
+      <w:r>
+        <w:t xml:space="preserve">commande </w:t>
+      </w:r>
+    </w:p>
+    <w:p>
+      <w:pPr>
+        <w:pStyle w:val="Paragraphedeliste"/>
+        <w:numPr>
+          <w:ilvl w:val="0"/>
+          <w:numId w:val="17"/>
+        </w:numPr>
+      </w:pPr>
+      <w:r>
+        <w:t xml:space="preserve">avis </w:t>
+      </w:r>
+    </w:p>
+    <w:p>
+      <w:pPr>
+        <w:pStyle w:val="Paragraphedeliste"/>
+        <w:numPr>
+          <w:ilvl w:val="0"/>
+          <w:numId w:val="17"/>
+        </w:numPr>
+      </w:pPr>
+      <w:r>
+        <w:t xml:space="preserve">image </w:t>
+      </w:r>
+    </w:p>
+    <w:p>
+      <w:pPr>
+        <w:pStyle w:val="Paragraphedeliste"/>
+        <w:numPr>
+          <w:ilvl w:val="0"/>
+          <w:numId w:val="17"/>
+        </w:numPr>
+      </w:pPr>
+      <w:proofErr w:type="spellStart"/>
+      <w:r>
+        <w:t>theme</w:t>
+      </w:r>
+      <w:proofErr w:type="spellEnd"/>
+      <w:r>
+        <w:t xml:space="preserve"> </w:t>
+      </w:r>
+    </w:p>
+    <w:p>
+      <w:pPr>
+        <w:pStyle w:val="Paragraphedeliste"/>
+        <w:numPr>
+          <w:ilvl w:val="0"/>
+          <w:numId w:val="17"/>
+        </w:numPr>
+      </w:pPr>
+      <w:proofErr w:type="spellStart"/>
+      <w:r>
+        <w:t>regime</w:t>
+      </w:r>
+      <w:proofErr w:type="spellEnd"/>
+      <w:r>
+        <w:t xml:space="preserve"> </w:t>
+      </w:r>
+    </w:p>
+    <w:p>
+      <w:pPr>
+        <w:pStyle w:val="Paragraphedeliste"/>
+        <w:numPr>
+          <w:ilvl w:val="0"/>
+          <w:numId w:val="17"/>
+        </w:numPr>
+      </w:pPr>
+      <w:proofErr w:type="spellStart"/>
+      <w:r>
+        <w:t>allergene</w:t>
+      </w:r>
+      <w:proofErr w:type="spellEnd"/>
+      <w:r>
+        <w:t xml:space="preserve"> </w:t>
+      </w:r>
+    </w:p>
+    <w:p>
+      <w:r>
+        <w:t>La connexion a été adaptée pour permettre :</w:t>
+      </w:r>
+    </w:p>
+    <w:p>
+      <w:pPr>
+        <w:pStyle w:val="Paragraphedeliste"/>
+        <w:numPr>
+          <w:ilvl w:val="0"/>
+          <w:numId w:val="18"/>
+        </w:numPr>
+      </w:pPr>
+      <w:r>
+        <w:t>l’utilisation du fichier .</w:t>
+      </w:r>
+      <w:proofErr w:type="spellStart"/>
+      <w:r>
+        <w:t>env</w:t>
+      </w:r>
+      <w:proofErr w:type="spellEnd"/>
+      <w:r>
+        <w:t xml:space="preserve"> en environnement local ; </w:t>
+      </w:r>
+    </w:p>
+    <w:p>
+      <w:pPr>
+        <w:pStyle w:val="Paragraphedeliste"/>
+        <w:numPr>
+          <w:ilvl w:val="0"/>
+          <w:numId w:val="18"/>
+        </w:numPr>
+      </w:pPr>
+      <w:r>
+        <w:t xml:space="preserve">l’utilisation des variables d’environnement </w:t>
+      </w:r>
+      <w:proofErr w:type="spellStart"/>
+      <w:r>
+        <w:t>Heroku</w:t>
+      </w:r>
+      <w:proofErr w:type="spellEnd"/>
+      <w:r>
+        <w:t xml:space="preserve"> en production.</w:t>
+      </w:r>
+    </w:p>
+    <w:p>
+      <w:pPr>
+        <w:pStyle w:val="Titre3"/>
+      </w:pPr>
+      <w:r>
+        <w:t>Base de données NoSQL</w:t>
+      </w:r>
+    </w:p>
+    <w:p>
+      <w:pPr>
+        <w:pStyle w:val="NormalWeb"/>
+        <w:rPr>
+          <w:rFonts w:asciiTheme="minorHAnsi" w:hAnsiTheme="minorHAnsi"/>
+        </w:rPr>
+      </w:pPr>
+      <w:r>
+        <w:rPr>
+          <w:rFonts w:asciiTheme="minorHAnsi" w:hAnsiTheme="minorHAnsi"/>
+        </w:rPr>
+        <w:t xml:space="preserve">Pour certaines fonctionnalités statistiques de l’espace administrateur, une base </w:t>
+      </w:r>
+      <w:r>
+        <w:rPr>
+          <w:rStyle w:val="lev"/>
+          <w:rFonts w:asciiTheme="minorHAnsi" w:hAnsiTheme="minorHAnsi"/>
+          <w:b w:val="0"/>
+          <w:bCs w:val="0"/>
+        </w:rPr>
+        <w:t>MongoDB Atlas</w:t>
+      </w:r>
+      <w:r>
+        <w:rPr>
+          <w:rFonts w:asciiTheme="minorHAnsi" w:hAnsiTheme="minorHAnsi"/>
+        </w:rPr>
+        <w:t xml:space="preserve"> a été utilisée.</w:t>
+      </w:r>
+    </w:p>
+    <w:p>
+      <w:pPr>
+        <w:pStyle w:val="NormalWeb"/>
+        <w:rPr>
+          <w:rFonts w:asciiTheme="minorHAnsi" w:hAnsiTheme="minorHAnsi"/>
+        </w:rPr>
+      </w:pPr>
+      <w:r>
+        <w:rPr>
+          <w:rFonts w:asciiTheme="minorHAnsi" w:hAnsiTheme="minorHAnsi"/>
+        </w:rPr>
+        <w:t>Cette base permet de manipuler des données destinées au suivi et à l’analyse.</w:t>
+      </w:r>
+    </w:p>
+    <w:p>
+      <w:pPr>
+        <w:pStyle w:val="Titre2"/>
+        <w:rPr>
+          <w:rFonts w:eastAsia="Times New Roman"/>
+        </w:rPr>
+      </w:pPr>
+      <w:r>
+        <w:rPr>
+          <w:rFonts w:eastAsia="Times New Roman"/>
+        </w:rPr>
+        <w:t>Configuration des emails transactionnels</w:t>
+      </w:r>
+    </w:p>
+    <w:p>
+      <w:pPr>
+        <w:pStyle w:val="NormalWeb"/>
+        <w:rPr>
+          <w:rFonts w:asciiTheme="minorHAnsi" w:hAnsiTheme="minorHAnsi"/>
+        </w:rPr>
+      </w:pPr>
+      <w:r>
+        <w:rPr>
+          <w:rFonts w:asciiTheme="minorHAnsi" w:hAnsiTheme="minorHAnsi"/>
+        </w:rPr>
+        <w:t>L’envoi d’emails a été configuré avec Brevo SMTP.</w:t>
+      </w:r>
+    </w:p>
+    <w:p>
+      <w:pPr>
+        <w:pStyle w:val="NormalWeb"/>
+        <w:rPr>
+          <w:rFonts w:asciiTheme="minorHAnsi" w:hAnsiTheme="minorHAnsi"/>
+        </w:rPr>
+      </w:pPr>
+      <w:r>
+        <w:rPr>
+          <w:rFonts w:asciiTheme="minorHAnsi" w:hAnsiTheme="minorHAnsi"/>
+        </w:rPr>
+        <w:t>Ce système permet notamment :</w:t>
+      </w:r>
+    </w:p>
+    <w:p>
+      <w:pPr>
+        <w:pStyle w:val="NormalWeb"/>
+        <w:numPr>
+          <w:ilvl w:val="0"/>
+          <w:numId w:val="21"/>
+        </w:numPr>
+        <w:rPr>
+          <w:rFonts w:asciiTheme="minorHAnsi" w:hAnsiTheme="minorHAnsi"/>
+        </w:rPr>
+      </w:pPr>
+      <w:r>
+        <w:rPr>
+          <w:rFonts w:asciiTheme="minorHAnsi" w:hAnsiTheme="minorHAnsi"/>
+        </w:rPr>
+        <w:t xml:space="preserve">l’envoi des confirmations de commande ; </w:t>
+      </w:r>
+    </w:p>
+    <w:p>
+      <w:pPr>
+        <w:pStyle w:val="NormalWeb"/>
+        <w:numPr>
+          <w:ilvl w:val="0"/>
+          <w:numId w:val="21"/>
+        </w:numPr>
+        <w:rPr>
+          <w:rFonts w:asciiTheme="minorHAnsi" w:hAnsiTheme="minorHAnsi"/>
+        </w:rPr>
+      </w:pPr>
+      <w:r>
+        <w:rPr>
+          <w:rFonts w:asciiTheme="minorHAnsi" w:hAnsiTheme="minorHAnsi"/>
+        </w:rPr>
+        <w:t xml:space="preserve">l’envoi des emails de création de compte ; </w:t>
+      </w:r>
+    </w:p>
+    <w:p>
+      <w:pPr>
+        <w:pStyle w:val="NormalWeb"/>
+        <w:numPr>
+          <w:ilvl w:val="0"/>
+          <w:numId w:val="21"/>
+        </w:numPr>
+        <w:rPr>
+          <w:rFonts w:asciiTheme="minorHAnsi" w:hAnsiTheme="minorHAnsi"/>
+        </w:rPr>
+      </w:pPr>
+      <w:r>
+        <w:rPr>
+          <w:rFonts w:asciiTheme="minorHAnsi" w:hAnsiTheme="minorHAnsi"/>
+        </w:rPr>
+        <w:t xml:space="preserve">la réinitialisation du mot de passe ; </w:t>
+      </w:r>
+    </w:p>
+    <w:p>
+      <w:pPr>
+        <w:pStyle w:val="NormalWeb"/>
+        <w:numPr>
+          <w:ilvl w:val="0"/>
+          <w:numId w:val="21"/>
+        </w:numPr>
+        <w:rPr>
+          <w:rFonts w:asciiTheme="minorHAnsi" w:hAnsiTheme="minorHAnsi"/>
+        </w:rPr>
+      </w:pPr>
+      <w:r>
+        <w:rPr>
+          <w:rFonts w:asciiTheme="minorHAnsi" w:hAnsiTheme="minorHAnsi"/>
+        </w:rPr>
+        <w:t xml:space="preserve">le formulaire de contact. </w:t>
+      </w:r>
+    </w:p>
+    <w:p>
+      <w:pPr>
+        <w:pStyle w:val="NormalWeb"/>
+        <w:rPr>
+          <w:rFonts w:asciiTheme="minorHAnsi" w:hAnsiTheme="minorHAnsi"/>
+        </w:rPr>
+      </w:pPr>
+      <w:r>
+        <w:rPr>
+          <w:rFonts w:asciiTheme="minorHAnsi" w:hAnsiTheme="minorHAnsi"/>
+        </w:rPr>
+        <w:t>La configuration a été réalisée via les variables d’environnement afin d’éviter le stockage des informations sensibles dans le code source.</w:t>
+      </w:r>
+    </w:p>
+    <w:p>
+      <w:pPr>
+        <w:pStyle w:val="NormalWeb"/>
+        <w:rPr>
+          <w:rFonts w:asciiTheme="minorHAnsi" w:hAnsiTheme="minorHAnsi"/>
+        </w:rPr>
+      </w:pPr>
+    </w:p>
+    <w:p>
+      <w:pPr>
+        <w:pStyle w:val="Titre2"/>
+        <w:rPr>
+          <w:rFonts w:eastAsia="Times New Roman"/>
+        </w:rPr>
+      </w:pPr>
+      <w:r>
+        <w:rPr>
+          <w:rFonts w:eastAsia="Times New Roman"/>
+        </w:rPr>
+        <w:t>Vérifications réalisées après déploiement</w:t>
+      </w:r>
+    </w:p>
+    <w:p>
+      <w:pPr>
+        <w:pStyle w:val="NormalWeb"/>
+        <w:rPr>
+          <w:rFonts w:asciiTheme="minorHAnsi" w:hAnsiTheme="minorHAnsi"/>
+        </w:rPr>
+      </w:pPr>
+      <w:r>
+        <w:rPr>
+          <w:rFonts w:asciiTheme="minorHAnsi" w:hAnsiTheme="minorHAnsi"/>
+        </w:rPr>
+        <w:t>Après le déploiement, plusieurs vérifications ont été réalisées :</w:t>
+      </w:r>
+    </w:p>
+    <w:p>
+      <w:pPr>
+        <w:pStyle w:val="NormalWeb"/>
+        <w:numPr>
+          <w:ilvl w:val="0"/>
+          <w:numId w:val="20"/>
+        </w:numPr>
+        <w:rPr>
+          <w:rFonts w:asciiTheme="minorHAnsi" w:hAnsiTheme="minorHAnsi"/>
+        </w:rPr>
+      </w:pPr>
+      <w:r>
+        <w:rPr>
+          <w:rFonts w:asciiTheme="minorHAnsi" w:hAnsiTheme="minorHAnsi"/>
+        </w:rPr>
+        <w:t xml:space="preserve">accès au site ; </w:t>
+      </w:r>
+    </w:p>
+    <w:p>
+      <w:pPr>
+        <w:pStyle w:val="NormalWeb"/>
+        <w:numPr>
+          <w:ilvl w:val="0"/>
+          <w:numId w:val="20"/>
+        </w:numPr>
+        <w:rPr>
+          <w:rFonts w:asciiTheme="minorHAnsi" w:hAnsiTheme="minorHAnsi"/>
+        </w:rPr>
+      </w:pPr>
+      <w:r>
+        <w:rPr>
+          <w:rFonts w:asciiTheme="minorHAnsi" w:hAnsiTheme="minorHAnsi"/>
+        </w:rPr>
+        <w:t xml:space="preserve">affichage des pages principales ; </w:t>
+      </w:r>
+    </w:p>
+    <w:p>
+      <w:pPr>
+        <w:pStyle w:val="NormalWeb"/>
+        <w:numPr>
+          <w:ilvl w:val="0"/>
+          <w:numId w:val="20"/>
+        </w:numPr>
+        <w:rPr>
+          <w:rFonts w:asciiTheme="minorHAnsi" w:hAnsiTheme="minorHAnsi"/>
+        </w:rPr>
+      </w:pPr>
+      <w:r>
+        <w:rPr>
+          <w:rFonts w:asciiTheme="minorHAnsi" w:hAnsiTheme="minorHAnsi"/>
+        </w:rPr>
+        <w:t xml:space="preserve">connexion utilisateur ; </w:t>
+      </w:r>
+    </w:p>
+    <w:p>
+      <w:pPr>
+        <w:pStyle w:val="NormalWeb"/>
+        <w:numPr>
+          <w:ilvl w:val="0"/>
+          <w:numId w:val="20"/>
+        </w:numPr>
+        <w:rPr>
+          <w:rFonts w:asciiTheme="minorHAnsi" w:hAnsiTheme="minorHAnsi"/>
+        </w:rPr>
+      </w:pPr>
+      <w:r>
+        <w:rPr>
+          <w:rFonts w:asciiTheme="minorHAnsi" w:hAnsiTheme="minorHAnsi"/>
+        </w:rPr>
+        <w:t xml:space="preserve">fonctionnement des formulaires ; </w:t>
+      </w:r>
+    </w:p>
+    <w:p>
+      <w:pPr>
+        <w:pStyle w:val="NormalWeb"/>
+        <w:numPr>
+          <w:ilvl w:val="0"/>
+          <w:numId w:val="20"/>
+        </w:numPr>
+        <w:rPr>
+          <w:rFonts w:asciiTheme="minorHAnsi" w:hAnsiTheme="minorHAnsi"/>
+        </w:rPr>
+      </w:pPr>
+      <w:r>
+        <w:rPr>
+          <w:rFonts w:asciiTheme="minorHAnsi" w:hAnsiTheme="minorHAnsi"/>
+        </w:rPr>
+        <w:t xml:space="preserve">accès aux espaces utilisateur, employé et administrateur ; </w:t>
+      </w:r>
+    </w:p>
+    <w:p>
+      <w:pPr>
+        <w:pStyle w:val="NormalWeb"/>
+        <w:numPr>
+          <w:ilvl w:val="0"/>
+          <w:numId w:val="20"/>
+        </w:numPr>
+        <w:rPr>
+          <w:rFonts w:asciiTheme="minorHAnsi" w:hAnsiTheme="minorHAnsi"/>
+        </w:rPr>
+      </w:pPr>
+      <w:r>
+        <w:rPr>
+          <w:rFonts w:asciiTheme="minorHAnsi" w:hAnsiTheme="minorHAnsi"/>
+        </w:rPr>
+        <w:t xml:space="preserve">vérification des bases de données ; </w:t>
+      </w:r>
+    </w:p>
+    <w:p>
+      <w:pPr>
+        <w:pStyle w:val="NormalWeb"/>
+        <w:numPr>
+          <w:ilvl w:val="0"/>
+          <w:numId w:val="20"/>
+        </w:numPr>
+        <w:rPr>
+          <w:rFonts w:asciiTheme="minorHAnsi" w:hAnsiTheme="minorHAnsi"/>
+        </w:rPr>
+      </w:pPr>
+      <w:r>
+        <w:rPr>
+          <w:rFonts w:asciiTheme="minorHAnsi" w:hAnsiTheme="minorHAnsi"/>
+        </w:rPr>
+        <w:t xml:space="preserve">tests d’envoi d’emails. </w:t>
+      </w:r>
+    </w:p>
+    <w:p>
+      <w:pPr>
+        <w:pStyle w:val="NormalWeb"/>
+        <w:rPr>
+          <w:rFonts w:asciiTheme="minorHAnsi" w:hAnsiTheme="minorHAnsi"/>
+        </w:rPr>
+      </w:pPr>
+    </w:p>
+    <w:p>
+      <w:pPr>
+        <w:pStyle w:val="Titre2"/>
+        <w:rPr>
+          <w:rFonts w:eastAsia="Times New Roman"/>
+        </w:rPr>
+      </w:pPr>
+      <w:r>
+        <w:rPr>
+          <w:rFonts w:eastAsia="Times New Roman"/>
+        </w:rPr>
+        <w:t>Conclusion</w:t>
+      </w:r>
+    </w:p>
+    <w:p>
+      <w:pPr>
+        <w:pStyle w:val="NormalWeb"/>
+        <w:rPr>
+          <w:rFonts w:asciiTheme="minorHAnsi" w:hAnsiTheme="minorHAnsi"/>
+        </w:rPr>
+      </w:pPr>
+      <w:r>
+        <w:rPr>
+          <w:rFonts w:asciiTheme="minorHAnsi" w:hAnsiTheme="minorHAnsi"/>
+        </w:rPr>
+        <w:t>Le déploiement a permis de rendre l’application accessible en ligne tout en conservant les fonctionnalités principales du projet. Cette étape m’a permis de découvrir la configuration d’un environnement de production ainsi que l’utilisation de services externes pour la base de données et l’envoi d’emails.</w:t>
+      </w:r>
+    </w:p>
+    <w:p>
+      <w:pPr>
+        <w:pStyle w:val="NormalWeb"/>
+        <w:rPr>
+          <w:rFonts w:asciiTheme="minorHAnsi" w:hAnsiTheme="minorHAnsi"/>
+        </w:rPr>
+      </w:pPr>
+    </w:p>
+    <w:p/>
+    <w:p/>
     <w:sectPr>
       <w:pgSz w:w="11906" w:h="16838"/>
       <w:pgMar w:top="1417" w:right="1417" w:bottom="1417" w:left="1417" w:header="708" w:footer="708" w:gutter="0"/>
@@ -933,6 +1579,268 @@
 <file path=word/numbering.xml><?xml version="1.0" encoding="utf-8"?>
 <w:numbering xmlns:wpc="http://schemas.microsoft.com/office/word/2010/wordprocessingCanvas" xmlns:cx="http://schemas.microsoft.com/office/drawing/2014/chartex" xmlns:cx1="http://schemas.microsoft.com/office/drawing/2015/9/8/chartex" xmlns:cx2="http://schemas.microsoft.com/office/drawing/2015/10/21/chartex" xmlns:cx3="http://schemas.microsoft.com/office/drawing/2016/5/9/chartex" xmlns:cx4="http://schemas.microsoft.com/office/drawing/2016/5/10/chartex" xmlns:cx5="http://schemas.microsoft.com/office/drawing/2016/5/11/chartex" xmlns:cx6="http://schemas.microsoft.com/office/drawing/2016/5/12/chartex" xmlns:cx7="http://schemas.microsoft.com/office/drawing/2016/5/13/chartex" xmlns:cx8="http://schemas.microsoft.com/office/drawing/2016/5/14/chartex" xmlns:mc="http://schemas.openxmlformats.org/markup-compatibility/2006" xmlns:aink="http://schemas.microsoft.com/office/drawing/2016/ink" xmlns:am3d="http://schemas.microsoft.com/office/drawing/2017/model3d" xmlns:o="urn:schemas-microsoft-com:office:office" xmlns:oel="http://schemas.microsoft.com/office/2019/extlst" xmlns:r="http://schemas.openxmlformats.org/officeDocument/2006/relationships" xmlns:m="http://schemas.openxmlformats.org/officeDocument/2006/math" xmlns:v="urn:schemas-microsoft-com:vml" xmlns:wp14="http://schemas.microsoft.com/office/word/2010/wordprocessingDrawing" xmlns:wp="http://schemas.openxmlformats.org/drawingml/2006/wordprocessingDrawing" xmlns:w10="urn:schemas-microsoft-com:office:word" xmlns:w="http://schemas.openxmlformats.org/wordprocessingml/2006/main" xmlns:w14="http://schemas.microsoft.com/office/word/2010/wordml" xmlns:w15="http://schemas.microsoft.com/office/word/2012/wordml" xmlns:w16cex="http://schemas.microsoft.com/office/word/2018/wordml/cex" xmlns:w16cid="http://schemas.microsoft.com/office/word/2016/wordml/cid" xmlns:w16="http://schemas.microsoft.com/office/word/2018/wordml" xmlns:w16du="http://schemas.microsoft.com/office/word/2023/wordml/word16du" xmlns:w16sdtdh="http://schemas.microsoft.com/office/word/2020/wordml/sdtdatahash" xmlns:w16sdtfl="http://schemas.microsoft.com/office/word/2024/wordml/sdtformatlock" xmlns:w16se="http://schemas.microsoft.com/office/word/2015/wordml/symex" xmlns:wpg="http://schemas.microsoft.com/office/word/2010/wordprocessingGroup" xmlns:wpi="http://schemas.microsoft.com/office/word/2010/wordprocessingInk" xmlns:wne="http://schemas.microsoft.com/office/word/2006/wordml" xmlns:wps="http://schemas.microsoft.com/office/word/2010/wordprocessingShape" mc:Ignorable="w14 w15 w16se w16cid w16 w16cex w16sdtdh w16sdtfl w16du wp14">
   <w:abstractNum w:abstractNumId="0" w15:restartNumberingAfterBreak="0">
+    <w:nsid w:val="05640713"/>
+    <w:multiLevelType w:val="multilevel"/>
+    <w:tmpl w:val="3E942FD0"/>
+    <w:lvl w:ilvl="0">
+      <w:start w:val="1"/>
+      <w:numFmt w:val="bullet"/>
+      <w:lvlText w:val=""/>
+      <w:lvlJc w:val="left"/>
+      <w:pPr>
+        <w:tabs>
+          <w:tab w:val="num" w:pos="720"/>
+        </w:tabs>
+        <w:ind w:left="720" w:hanging="360"/>
+      </w:pPr>
+      <w:rPr>
+        <w:rFonts w:ascii="Symbol" w:hAnsi="Symbol" w:hint="default"/>
+        <w:sz w:val="20"/>
+      </w:rPr>
+    </w:lvl>
+    <w:lvl w:ilvl="1" w:tentative="1">
+      <w:start w:val="1"/>
+      <w:numFmt w:val="bullet"/>
+      <w:lvlText w:val="o"/>
+      <w:lvlJc w:val="left"/>
+      <w:pPr>
+        <w:tabs>
+          <w:tab w:val="num" w:pos="1440"/>
+        </w:tabs>
+        <w:ind w:left="1440" w:hanging="360"/>
+      </w:pPr>
+      <w:rPr>
+        <w:rFonts w:ascii="Courier New" w:hAnsi="Courier New" w:hint="default"/>
+        <w:sz w:val="20"/>
+      </w:rPr>
+    </w:lvl>
+    <w:lvl w:ilvl="2" w:tentative="1">
+      <w:start w:val="1"/>
+      <w:numFmt w:val="bullet"/>
+      <w:lvlText w:val=""/>
+      <w:lvlJc w:val="left"/>
+      <w:pPr>
+        <w:tabs>
+          <w:tab w:val="num" w:pos="2160"/>
+        </w:tabs>
+        <w:ind w:left="2160" w:hanging="360"/>
+      </w:pPr>
+      <w:rPr>
+        <w:rFonts w:ascii="Wingdings" w:hAnsi="Wingdings" w:hint="default"/>
+        <w:sz w:val="20"/>
+      </w:rPr>
+    </w:lvl>
+    <w:lvl w:ilvl="3" w:tentative="1">
+      <w:start w:val="1"/>
+      <w:numFmt w:val="bullet"/>
+      <w:lvlText w:val=""/>
+      <w:lvlJc w:val="left"/>
+      <w:pPr>
+        <w:tabs>
+          <w:tab w:val="num" w:pos="2880"/>
+        </w:tabs>
+        <w:ind w:left="2880" w:hanging="360"/>
+      </w:pPr>
+      <w:rPr>
+        <w:rFonts w:ascii="Wingdings" w:hAnsi="Wingdings" w:hint="default"/>
+        <w:sz w:val="20"/>
+      </w:rPr>
+    </w:lvl>
+    <w:lvl w:ilvl="4" w:tentative="1">
+      <w:start w:val="1"/>
+      <w:numFmt w:val="bullet"/>
+      <w:lvlText w:val=""/>
+      <w:lvlJc w:val="left"/>
+      <w:pPr>
+        <w:tabs>
+          <w:tab w:val="num" w:pos="3600"/>
+        </w:tabs>
+        <w:ind w:left="3600" w:hanging="360"/>
+      </w:pPr>
+      <w:rPr>
+        <w:rFonts w:ascii="Wingdings" w:hAnsi="Wingdings" w:hint="default"/>
+        <w:sz w:val="20"/>
+      </w:rPr>
+    </w:lvl>
+    <w:lvl w:ilvl="5" w:tentative="1">
+      <w:start w:val="1"/>
+      <w:numFmt w:val="bullet"/>
+      <w:lvlText w:val=""/>
+      <w:lvlJc w:val="left"/>
+      <w:pPr>
+        <w:tabs>
+          <w:tab w:val="num" w:pos="4320"/>
+        </w:tabs>
+        <w:ind w:left="4320" w:hanging="360"/>
+      </w:pPr>
+      <w:rPr>
+        <w:rFonts w:ascii="Wingdings" w:hAnsi="Wingdings" w:hint="default"/>
+        <w:sz w:val="20"/>
+      </w:rPr>
+    </w:lvl>
+    <w:lvl w:ilvl="6" w:tentative="1">
+      <w:start w:val="1"/>
+      <w:numFmt w:val="bullet"/>
+      <w:lvlText w:val=""/>
+      <w:lvlJc w:val="left"/>
+      <w:pPr>
+        <w:tabs>
+          <w:tab w:val="num" w:pos="5040"/>
+        </w:tabs>
+        <w:ind w:left="5040" w:hanging="360"/>
+      </w:pPr>
+      <w:rPr>
+        <w:rFonts w:ascii="Wingdings" w:hAnsi="Wingdings" w:hint="default"/>
+        <w:sz w:val="20"/>
+      </w:rPr>
+    </w:lvl>
+    <w:lvl w:ilvl="7" w:tentative="1">
+      <w:start w:val="1"/>
+      <w:numFmt w:val="bullet"/>
+      <w:lvlText w:val=""/>
+      <w:lvlJc w:val="left"/>
+      <w:pPr>
+        <w:tabs>
+          <w:tab w:val="num" w:pos="5760"/>
+        </w:tabs>
+        <w:ind w:left="5760" w:hanging="360"/>
+      </w:pPr>
+      <w:rPr>
+        <w:rFonts w:ascii="Wingdings" w:hAnsi="Wingdings" w:hint="default"/>
+        <w:sz w:val="20"/>
+      </w:rPr>
+    </w:lvl>
+    <w:lvl w:ilvl="8" w:tentative="1">
+      <w:start w:val="1"/>
+      <w:numFmt w:val="bullet"/>
+      <w:lvlText w:val=""/>
+      <w:lvlJc w:val="left"/>
+      <w:pPr>
+        <w:tabs>
+          <w:tab w:val="num" w:pos="6480"/>
+        </w:tabs>
+        <w:ind w:left="6480" w:hanging="360"/>
+      </w:pPr>
+      <w:rPr>
+        <w:rFonts w:ascii="Wingdings" w:hAnsi="Wingdings" w:hint="default"/>
+        <w:sz w:val="20"/>
+      </w:rPr>
+    </w:lvl>
+  </w:abstractNum>
+  <w:abstractNum w:abstractNumId="1" w15:restartNumberingAfterBreak="0">
+    <w:nsid w:val="08C06E09"/>
+    <w:multiLevelType w:val="hybridMultilevel"/>
+    <w:tmpl w:val="4AF64CD4"/>
+    <w:lvl w:ilvl="0" w:tplc="040C0001">
+      <w:start w:val="1"/>
+      <w:numFmt w:val="bullet"/>
+      <w:lvlText w:val=""/>
+      <w:lvlJc w:val="left"/>
+      <w:pPr>
+        <w:ind w:left="1080" w:hanging="360"/>
+      </w:pPr>
+      <w:rPr>
+        <w:rFonts w:ascii="Symbol" w:hAnsi="Symbol" w:hint="default"/>
+      </w:rPr>
+    </w:lvl>
+    <w:lvl w:ilvl="1" w:tplc="040C0003" w:tentative="1">
+      <w:start w:val="1"/>
+      <w:numFmt w:val="bullet"/>
+      <w:lvlText w:val="o"/>
+      <w:lvlJc w:val="left"/>
+      <w:pPr>
+        <w:ind w:left="1800" w:hanging="360"/>
+      </w:pPr>
+      <w:rPr>
+        <w:rFonts w:ascii="Courier New" w:hAnsi="Courier New" w:cs="Courier New" w:hint="default"/>
+      </w:rPr>
+    </w:lvl>
+    <w:lvl w:ilvl="2" w:tplc="040C0005" w:tentative="1">
+      <w:start w:val="1"/>
+      <w:numFmt w:val="bullet"/>
+      <w:lvlText w:val=""/>
+      <w:lvlJc w:val="left"/>
+      <w:pPr>
+        <w:ind w:left="2520" w:hanging="360"/>
+      </w:pPr>
+      <w:rPr>
+        <w:rFonts w:ascii="Wingdings" w:hAnsi="Wingdings" w:hint="default"/>
+      </w:rPr>
+    </w:lvl>
+    <w:lvl w:ilvl="3" w:tplc="040C0001" w:tentative="1">
+      <w:start w:val="1"/>
+      <w:numFmt w:val="bullet"/>
+      <w:lvlText w:val=""/>
+      <w:lvlJc w:val="left"/>
+      <w:pPr>
+        <w:ind w:left="3240" w:hanging="360"/>
+      </w:pPr>
+      <w:rPr>
+        <w:rFonts w:ascii="Symbol" w:hAnsi="Symbol" w:hint="default"/>
+      </w:rPr>
+    </w:lvl>
+    <w:lvl w:ilvl="4" w:tplc="040C0003" w:tentative="1">
+      <w:start w:val="1"/>
+      <w:numFmt w:val="bullet"/>
+      <w:lvlText w:val="o"/>
+      <w:lvlJc w:val="left"/>
+      <w:pPr>
+        <w:ind w:left="3960" w:hanging="360"/>
+      </w:pPr>
+      <w:rPr>
+        <w:rFonts w:ascii="Courier New" w:hAnsi="Courier New" w:cs="Courier New" w:hint="default"/>
+      </w:rPr>
+    </w:lvl>
+    <w:lvl w:ilvl="5" w:tplc="040C0005" w:tentative="1">
+      <w:start w:val="1"/>
+      <w:numFmt w:val="bullet"/>
+      <w:lvlText w:val=""/>
+      <w:lvlJc w:val="left"/>
+      <w:pPr>
+        <w:ind w:left="4680" w:hanging="360"/>
+      </w:pPr>
+      <w:rPr>
+        <w:rFonts w:ascii="Wingdings" w:hAnsi="Wingdings" w:hint="default"/>
+      </w:rPr>
+    </w:lvl>
+    <w:lvl w:ilvl="6" w:tplc="040C0001" w:tentative="1">
+      <w:start w:val="1"/>
+      <w:numFmt w:val="bullet"/>
+      <w:lvlText w:val=""/>
+      <w:lvlJc w:val="left"/>
+      <w:pPr>
+        <w:ind w:left="5400" w:hanging="360"/>
+      </w:pPr>
+      <w:rPr>
+        <w:rFonts w:ascii="Symbol" w:hAnsi="Symbol" w:hint="default"/>
+      </w:rPr>
+    </w:lvl>
+    <w:lvl w:ilvl="7" w:tplc="040C0003" w:tentative="1">
+      <w:start w:val="1"/>
+      <w:numFmt w:val="bullet"/>
+      <w:lvlText w:val="o"/>
+      <w:lvlJc w:val="left"/>
+      <w:pPr>
+        <w:ind w:left="6120" w:hanging="360"/>
+      </w:pPr>
+      <w:rPr>
+        <w:rFonts w:ascii="Courier New" w:hAnsi="Courier New" w:cs="Courier New" w:hint="default"/>
+      </w:rPr>
+    </w:lvl>
+    <w:lvl w:ilvl="8" w:tplc="040C0005" w:tentative="1">
+      <w:start w:val="1"/>
+      <w:numFmt w:val="bullet"/>
+      <w:lvlText w:val=""/>
+      <w:lvlJc w:val="left"/>
+      <w:pPr>
+        <w:ind w:left="6840" w:hanging="360"/>
+      </w:pPr>
+      <w:rPr>
+        <w:rFonts w:ascii="Wingdings" w:hAnsi="Wingdings" w:hint="default"/>
+      </w:rPr>
+    </w:lvl>
+  </w:abstractNum>
+  <w:abstractNum w:abstractNumId="2" w15:restartNumberingAfterBreak="0">
     <w:nsid w:val="0B672635"/>
     <w:multiLevelType w:val="hybridMultilevel"/>
     <w:tmpl w:val="CABAC670"/>
@@ -1045,7 +1953,269 @@
       </w:rPr>
     </w:lvl>
   </w:abstractNum>
-  <w:abstractNum w:abstractNumId="1" w15:restartNumberingAfterBreak="0">
+  <w:abstractNum w:abstractNumId="3" w15:restartNumberingAfterBreak="0">
+    <w:nsid w:val="0D343D38"/>
+    <w:multiLevelType w:val="multilevel"/>
+    <w:tmpl w:val="8FC29262"/>
+    <w:lvl w:ilvl="0">
+      <w:start w:val="1"/>
+      <w:numFmt w:val="bullet"/>
+      <w:lvlText w:val=""/>
+      <w:lvlJc w:val="left"/>
+      <w:pPr>
+        <w:tabs>
+          <w:tab w:val="num" w:pos="720"/>
+        </w:tabs>
+        <w:ind w:left="720" w:hanging="360"/>
+      </w:pPr>
+      <w:rPr>
+        <w:rFonts w:ascii="Symbol" w:hAnsi="Symbol" w:hint="default"/>
+        <w:sz w:val="20"/>
+      </w:rPr>
+    </w:lvl>
+    <w:lvl w:ilvl="1" w:tentative="1">
+      <w:start w:val="1"/>
+      <w:numFmt w:val="bullet"/>
+      <w:lvlText w:val="o"/>
+      <w:lvlJc w:val="left"/>
+      <w:pPr>
+        <w:tabs>
+          <w:tab w:val="num" w:pos="1440"/>
+        </w:tabs>
+        <w:ind w:left="1440" w:hanging="360"/>
+      </w:pPr>
+      <w:rPr>
+        <w:rFonts w:ascii="Courier New" w:hAnsi="Courier New" w:hint="default"/>
+        <w:sz w:val="20"/>
+      </w:rPr>
+    </w:lvl>
+    <w:lvl w:ilvl="2" w:tentative="1">
+      <w:start w:val="1"/>
+      <w:numFmt w:val="bullet"/>
+      <w:lvlText w:val=""/>
+      <w:lvlJc w:val="left"/>
+      <w:pPr>
+        <w:tabs>
+          <w:tab w:val="num" w:pos="2160"/>
+        </w:tabs>
+        <w:ind w:left="2160" w:hanging="360"/>
+      </w:pPr>
+      <w:rPr>
+        <w:rFonts w:ascii="Wingdings" w:hAnsi="Wingdings" w:hint="default"/>
+        <w:sz w:val="20"/>
+      </w:rPr>
+    </w:lvl>
+    <w:lvl w:ilvl="3" w:tentative="1">
+      <w:start w:val="1"/>
+      <w:numFmt w:val="bullet"/>
+      <w:lvlText w:val=""/>
+      <w:lvlJc w:val="left"/>
+      <w:pPr>
+        <w:tabs>
+          <w:tab w:val="num" w:pos="2880"/>
+        </w:tabs>
+        <w:ind w:left="2880" w:hanging="360"/>
+      </w:pPr>
+      <w:rPr>
+        <w:rFonts w:ascii="Wingdings" w:hAnsi="Wingdings" w:hint="default"/>
+        <w:sz w:val="20"/>
+      </w:rPr>
+    </w:lvl>
+    <w:lvl w:ilvl="4" w:tentative="1">
+      <w:start w:val="1"/>
+      <w:numFmt w:val="bullet"/>
+      <w:lvlText w:val=""/>
+      <w:lvlJc w:val="left"/>
+      <w:pPr>
+        <w:tabs>
+          <w:tab w:val="num" w:pos="3600"/>
+        </w:tabs>
+        <w:ind w:left="3600" w:hanging="360"/>
+      </w:pPr>
+      <w:rPr>
+        <w:rFonts w:ascii="Wingdings" w:hAnsi="Wingdings" w:hint="default"/>
+        <w:sz w:val="20"/>
+      </w:rPr>
+    </w:lvl>
+    <w:lvl w:ilvl="5" w:tentative="1">
+      <w:start w:val="1"/>
+      <w:numFmt w:val="bullet"/>
+      <w:lvlText w:val=""/>
+      <w:lvlJc w:val="left"/>
+      <w:pPr>
+        <w:tabs>
+          <w:tab w:val="num" w:pos="4320"/>
+        </w:tabs>
+        <w:ind w:left="4320" w:hanging="360"/>
+      </w:pPr>
+      <w:rPr>
+        <w:rFonts w:ascii="Wingdings" w:hAnsi="Wingdings" w:hint="default"/>
+        <w:sz w:val="20"/>
+      </w:rPr>
+    </w:lvl>
+    <w:lvl w:ilvl="6" w:tentative="1">
+      <w:start w:val="1"/>
+      <w:numFmt w:val="bullet"/>
+      <w:lvlText w:val=""/>
+      <w:lvlJc w:val="left"/>
+      <w:pPr>
+        <w:tabs>
+          <w:tab w:val="num" w:pos="5040"/>
+        </w:tabs>
+        <w:ind w:left="5040" w:hanging="360"/>
+      </w:pPr>
+      <w:rPr>
+        <w:rFonts w:ascii="Wingdings" w:hAnsi="Wingdings" w:hint="default"/>
+        <w:sz w:val="20"/>
+      </w:rPr>
+    </w:lvl>
+    <w:lvl w:ilvl="7" w:tentative="1">
+      <w:start w:val="1"/>
+      <w:numFmt w:val="bullet"/>
+      <w:lvlText w:val=""/>
+      <w:lvlJc w:val="left"/>
+      <w:pPr>
+        <w:tabs>
+          <w:tab w:val="num" w:pos="5760"/>
+        </w:tabs>
+        <w:ind w:left="5760" w:hanging="360"/>
+      </w:pPr>
+      <w:rPr>
+        <w:rFonts w:ascii="Wingdings" w:hAnsi="Wingdings" w:hint="default"/>
+        <w:sz w:val="20"/>
+      </w:rPr>
+    </w:lvl>
+    <w:lvl w:ilvl="8" w:tentative="1">
+      <w:start w:val="1"/>
+      <w:numFmt w:val="bullet"/>
+      <w:lvlText w:val=""/>
+      <w:lvlJc w:val="left"/>
+      <w:pPr>
+        <w:tabs>
+          <w:tab w:val="num" w:pos="6480"/>
+        </w:tabs>
+        <w:ind w:left="6480" w:hanging="360"/>
+      </w:pPr>
+      <w:rPr>
+        <w:rFonts w:ascii="Wingdings" w:hAnsi="Wingdings" w:hint="default"/>
+        <w:sz w:val="20"/>
+      </w:rPr>
+    </w:lvl>
+  </w:abstractNum>
+  <w:abstractNum w:abstractNumId="4" w15:restartNumberingAfterBreak="0">
+    <w:nsid w:val="11036528"/>
+    <w:multiLevelType w:val="hybridMultilevel"/>
+    <w:tmpl w:val="03BE0E98"/>
+    <w:lvl w:ilvl="0" w:tplc="040C0001">
+      <w:start w:val="1"/>
+      <w:numFmt w:val="bullet"/>
+      <w:lvlText w:val=""/>
+      <w:lvlJc w:val="left"/>
+      <w:pPr>
+        <w:ind w:left="720" w:hanging="360"/>
+      </w:pPr>
+      <w:rPr>
+        <w:rFonts w:ascii="Symbol" w:hAnsi="Symbol" w:hint="default"/>
+      </w:rPr>
+    </w:lvl>
+    <w:lvl w:ilvl="1" w:tplc="040C0003" w:tentative="1">
+      <w:start w:val="1"/>
+      <w:numFmt w:val="bullet"/>
+      <w:lvlText w:val="o"/>
+      <w:lvlJc w:val="left"/>
+      <w:pPr>
+        <w:ind w:left="1440" w:hanging="360"/>
+      </w:pPr>
+      <w:rPr>
+        <w:rFonts w:ascii="Courier New" w:hAnsi="Courier New" w:cs="Courier New" w:hint="default"/>
+      </w:rPr>
+    </w:lvl>
+    <w:lvl w:ilvl="2" w:tplc="040C0005" w:tentative="1">
+      <w:start w:val="1"/>
+      <w:numFmt w:val="bullet"/>
+      <w:lvlText w:val=""/>
+      <w:lvlJc w:val="left"/>
+      <w:pPr>
+        <w:ind w:left="2160" w:hanging="360"/>
+      </w:pPr>
+      <w:rPr>
+        <w:rFonts w:ascii="Wingdings" w:hAnsi="Wingdings" w:hint="default"/>
+      </w:rPr>
+    </w:lvl>
+    <w:lvl w:ilvl="3" w:tplc="040C0001" w:tentative="1">
+      <w:start w:val="1"/>
+      <w:numFmt w:val="bullet"/>
+      <w:lvlText w:val=""/>
+      <w:lvlJc w:val="left"/>
+      <w:pPr>
+        <w:ind w:left="2880" w:hanging="360"/>
+      </w:pPr>
+      <w:rPr>
+        <w:rFonts w:ascii="Symbol" w:hAnsi="Symbol" w:hint="default"/>
+      </w:rPr>
+    </w:lvl>
+    <w:lvl w:ilvl="4" w:tplc="040C0003" w:tentative="1">
+      <w:start w:val="1"/>
+      <w:numFmt w:val="bullet"/>
+      <w:lvlText w:val="o"/>
+      <w:lvlJc w:val="left"/>
+      <w:pPr>
+        <w:ind w:left="3600" w:hanging="360"/>
+      </w:pPr>
+      <w:rPr>
+        <w:rFonts w:ascii="Courier New" w:hAnsi="Courier New" w:cs="Courier New" w:hint="default"/>
+      </w:rPr>
+    </w:lvl>
+    <w:lvl w:ilvl="5" w:tplc="040C0005" w:tentative="1">
+      <w:start w:val="1"/>
+      <w:numFmt w:val="bullet"/>
+      <w:lvlText w:val=""/>
+      <w:lvlJc w:val="left"/>
+      <w:pPr>
+        <w:ind w:left="4320" w:hanging="360"/>
+      </w:pPr>
+      <w:rPr>
+        <w:rFonts w:ascii="Wingdings" w:hAnsi="Wingdings" w:hint="default"/>
+      </w:rPr>
+    </w:lvl>
+    <w:lvl w:ilvl="6" w:tplc="040C0001" w:tentative="1">
+      <w:start w:val="1"/>
+      <w:numFmt w:val="bullet"/>
+      <w:lvlText w:val=""/>
+      <w:lvlJc w:val="left"/>
+      <w:pPr>
+        <w:ind w:left="5040" w:hanging="360"/>
+      </w:pPr>
+      <w:rPr>
+        <w:rFonts w:ascii="Symbol" w:hAnsi="Symbol" w:hint="default"/>
+      </w:rPr>
+    </w:lvl>
+    <w:lvl w:ilvl="7" w:tplc="040C0003" w:tentative="1">
+      <w:start w:val="1"/>
+      <w:numFmt w:val="bullet"/>
+      <w:lvlText w:val="o"/>
+      <w:lvlJc w:val="left"/>
+      <w:pPr>
+        <w:ind w:left="5760" w:hanging="360"/>
+      </w:pPr>
+      <w:rPr>
+        <w:rFonts w:ascii="Courier New" w:hAnsi="Courier New" w:cs="Courier New" w:hint="default"/>
+      </w:rPr>
+    </w:lvl>
+    <w:lvl w:ilvl="8" w:tplc="040C0005" w:tentative="1">
+      <w:start w:val="1"/>
+      <w:numFmt w:val="bullet"/>
+      <w:lvlText w:val=""/>
+      <w:lvlJc w:val="left"/>
+      <w:pPr>
+        <w:ind w:left="6480" w:hanging="360"/>
+      </w:pPr>
+      <w:rPr>
+        <w:rFonts w:ascii="Wingdings" w:hAnsi="Wingdings" w:hint="default"/>
+      </w:rPr>
+    </w:lvl>
+  </w:abstractNum>
+  <w:abstractNum w:abstractNumId="5" w15:restartNumberingAfterBreak="0">
     <w:nsid w:val="15A75B66"/>
     <w:multiLevelType w:val="hybridMultilevel"/>
     <w:tmpl w:val="500410FC"/>
@@ -1158,7 +2328,7 @@
       </w:rPr>
     </w:lvl>
   </w:abstractNum>
-  <w:abstractNum w:abstractNumId="2" w15:restartNumberingAfterBreak="0">
+  <w:abstractNum w:abstractNumId="6" w15:restartNumberingAfterBreak="0">
     <w:nsid w:val="1D38152C"/>
     <w:multiLevelType w:val="hybridMultilevel"/>
     <w:tmpl w:val="E4C86D80"/>
@@ -1271,7 +2441,7 @@
       </w:rPr>
     </w:lvl>
   </w:abstractNum>
-  <w:abstractNum w:abstractNumId="3" w15:restartNumberingAfterBreak="0">
+  <w:abstractNum w:abstractNumId="7" w15:restartNumberingAfterBreak="0">
     <w:nsid w:val="287671FD"/>
     <w:multiLevelType w:val="hybridMultilevel"/>
     <w:tmpl w:val="7D8A7772"/>
@@ -1384,7 +2554,7 @@
       </w:rPr>
     </w:lvl>
   </w:abstractNum>
-  <w:abstractNum w:abstractNumId="4" w15:restartNumberingAfterBreak="0">
+  <w:abstractNum w:abstractNumId="8" w15:restartNumberingAfterBreak="0">
     <w:nsid w:val="28C079E0"/>
     <w:multiLevelType w:val="hybridMultilevel"/>
     <w:tmpl w:val="CDBAFB14"/>
@@ -1497,7 +2667,7 @@
       </w:rPr>
     </w:lvl>
   </w:abstractNum>
-  <w:abstractNum w:abstractNumId="5" w15:restartNumberingAfterBreak="0">
+  <w:abstractNum w:abstractNumId="9" w15:restartNumberingAfterBreak="0">
     <w:nsid w:val="38DB5975"/>
     <w:multiLevelType w:val="hybridMultilevel"/>
     <w:tmpl w:val="4412F1C2"/>
@@ -1610,7 +2780,120 @@
       </w:rPr>
     </w:lvl>
   </w:abstractNum>
-  <w:abstractNum w:abstractNumId="6" w15:restartNumberingAfterBreak="0">
+  <w:abstractNum w:abstractNumId="10" w15:restartNumberingAfterBreak="0">
+    <w:nsid w:val="396D5010"/>
+    <w:multiLevelType w:val="hybridMultilevel"/>
+    <w:tmpl w:val="93D869EC"/>
+    <w:lvl w:ilvl="0" w:tplc="040C0001">
+      <w:start w:val="1"/>
+      <w:numFmt w:val="bullet"/>
+      <w:lvlText w:val=""/>
+      <w:lvlJc w:val="left"/>
+      <w:pPr>
+        <w:ind w:left="1080" w:hanging="360"/>
+      </w:pPr>
+      <w:rPr>
+        <w:rFonts w:ascii="Symbol" w:hAnsi="Symbol" w:hint="default"/>
+      </w:rPr>
+    </w:lvl>
+    <w:lvl w:ilvl="1" w:tplc="040C0003" w:tentative="1">
+      <w:start w:val="1"/>
+      <w:numFmt w:val="bullet"/>
+      <w:lvlText w:val="o"/>
+      <w:lvlJc w:val="left"/>
+      <w:pPr>
+        <w:ind w:left="1800" w:hanging="360"/>
+      </w:pPr>
+      <w:rPr>
+        <w:rFonts w:ascii="Courier New" w:hAnsi="Courier New" w:cs="Courier New" w:hint="default"/>
+      </w:rPr>
+    </w:lvl>
+    <w:lvl w:ilvl="2" w:tplc="040C0005" w:tentative="1">
+      <w:start w:val="1"/>
+      <w:numFmt w:val="bullet"/>
+      <w:lvlText w:val=""/>
+      <w:lvlJc w:val="left"/>
+      <w:pPr>
+        <w:ind w:left="2520" w:hanging="360"/>
+      </w:pPr>
+      <w:rPr>
+        <w:rFonts w:ascii="Wingdings" w:hAnsi="Wingdings" w:hint="default"/>
+      </w:rPr>
+    </w:lvl>
+    <w:lvl w:ilvl="3" w:tplc="040C0001" w:tentative="1">
+      <w:start w:val="1"/>
+      <w:numFmt w:val="bullet"/>
+      <w:lvlText w:val=""/>
+      <w:lvlJc w:val="left"/>
+      <w:pPr>
+        <w:ind w:left="3240" w:hanging="360"/>
+      </w:pPr>
+      <w:rPr>
+        <w:rFonts w:ascii="Symbol" w:hAnsi="Symbol" w:hint="default"/>
+      </w:rPr>
+    </w:lvl>
+    <w:lvl w:ilvl="4" w:tplc="040C0003" w:tentative="1">
+      <w:start w:val="1"/>
+      <w:numFmt w:val="bullet"/>
+      <w:lvlText w:val="o"/>
+      <w:lvlJc w:val="left"/>
+      <w:pPr>
+        <w:ind w:left="3960" w:hanging="360"/>
+      </w:pPr>
+      <w:rPr>
+        <w:rFonts w:ascii="Courier New" w:hAnsi="Courier New" w:cs="Courier New" w:hint="default"/>
+      </w:rPr>
+    </w:lvl>
+    <w:lvl w:ilvl="5" w:tplc="040C0005" w:tentative="1">
+      <w:start w:val="1"/>
+      <w:numFmt w:val="bullet"/>
+      <w:lvlText w:val=""/>
+      <w:lvlJc w:val="left"/>
+      <w:pPr>
+        <w:ind w:left="4680" w:hanging="360"/>
+      </w:pPr>
+      <w:rPr>
+        <w:rFonts w:ascii="Wingdings" w:hAnsi="Wingdings" w:hint="default"/>
+      </w:rPr>
+    </w:lvl>
+    <w:lvl w:ilvl="6" w:tplc="040C0001" w:tentative="1">
+      <w:start w:val="1"/>
+      <w:numFmt w:val="bullet"/>
+      <w:lvlText w:val=""/>
+      <w:lvlJc w:val="left"/>
+      <w:pPr>
+        <w:ind w:left="5400" w:hanging="360"/>
+      </w:pPr>
+      <w:rPr>
+        <w:rFonts w:ascii="Symbol" w:hAnsi="Symbol" w:hint="default"/>
+      </w:rPr>
+    </w:lvl>
+    <w:lvl w:ilvl="7" w:tplc="040C0003" w:tentative="1">
+      <w:start w:val="1"/>
+      <w:numFmt w:val="bullet"/>
+      <w:lvlText w:val="o"/>
+      <w:lvlJc w:val="left"/>
+      <w:pPr>
+        <w:ind w:left="6120" w:hanging="360"/>
+      </w:pPr>
+      <w:rPr>
+        <w:rFonts w:ascii="Courier New" w:hAnsi="Courier New" w:cs="Courier New" w:hint="default"/>
+      </w:rPr>
+    </w:lvl>
+    <w:lvl w:ilvl="8" w:tplc="040C0005" w:tentative="1">
+      <w:start w:val="1"/>
+      <w:numFmt w:val="bullet"/>
+      <w:lvlText w:val=""/>
+      <w:lvlJc w:val="left"/>
+      <w:pPr>
+        <w:ind w:left="6840" w:hanging="360"/>
+      </w:pPr>
+      <w:rPr>
+        <w:rFonts w:ascii="Wingdings" w:hAnsi="Wingdings" w:hint="default"/>
+      </w:rPr>
+    </w:lvl>
+  </w:abstractNum>
+  <w:abstractNum w:abstractNumId="11" w15:restartNumberingAfterBreak="0">
     <w:nsid w:val="431E2911"/>
     <w:multiLevelType w:val="hybridMultilevel"/>
     <w:tmpl w:val="3538FD58"/>
@@ -1723,7 +3006,7 @@
       </w:rPr>
     </w:lvl>
   </w:abstractNum>
-  <w:abstractNum w:abstractNumId="7" w15:restartNumberingAfterBreak="0">
+  <w:abstractNum w:abstractNumId="12" w15:restartNumberingAfterBreak="0">
     <w:nsid w:val="44C44390"/>
     <w:multiLevelType w:val="hybridMultilevel"/>
     <w:tmpl w:val="6EA07B14"/>
@@ -1836,7 +3119,120 @@
       </w:rPr>
     </w:lvl>
   </w:abstractNum>
-  <w:abstractNum w:abstractNumId="8" w15:restartNumberingAfterBreak="0">
+  <w:abstractNum w:abstractNumId="13" w15:restartNumberingAfterBreak="0">
+    <w:nsid w:val="48D00C03"/>
+    <w:multiLevelType w:val="hybridMultilevel"/>
+    <w:tmpl w:val="0868FEA2"/>
+    <w:lvl w:ilvl="0" w:tplc="040C0001">
+      <w:start w:val="1"/>
+      <w:numFmt w:val="bullet"/>
+      <w:lvlText w:val=""/>
+      <w:lvlJc w:val="left"/>
+      <w:pPr>
+        <w:ind w:left="1080" w:hanging="360"/>
+      </w:pPr>
+      <w:rPr>
+        <w:rFonts w:ascii="Symbol" w:hAnsi="Symbol" w:hint="default"/>
+      </w:rPr>
+    </w:lvl>
+    <w:lvl w:ilvl="1" w:tplc="040C0003" w:tentative="1">
+      <w:start w:val="1"/>
+      <w:numFmt w:val="bullet"/>
+      <w:lvlText w:val="o"/>
+      <w:lvlJc w:val="left"/>
+      <w:pPr>
+        <w:ind w:left="1800" w:hanging="360"/>
+      </w:pPr>
+      <w:rPr>
+        <w:rFonts w:ascii="Courier New" w:hAnsi="Courier New" w:cs="Courier New" w:hint="default"/>
+      </w:rPr>
+    </w:lvl>
+    <w:lvl w:ilvl="2" w:tplc="040C0005" w:tentative="1">
+      <w:start w:val="1"/>
+      <w:numFmt w:val="bullet"/>
+      <w:lvlText w:val=""/>
+      <w:lvlJc w:val="left"/>
+      <w:pPr>
+        <w:ind w:left="2520" w:hanging="360"/>
+      </w:pPr>
+      <w:rPr>
+        <w:rFonts w:ascii="Wingdings" w:hAnsi="Wingdings" w:hint="default"/>
+      </w:rPr>
+    </w:lvl>
+    <w:lvl w:ilvl="3" w:tplc="040C0001" w:tentative="1">
+      <w:start w:val="1"/>
+      <w:numFmt w:val="bullet"/>
+      <w:lvlText w:val=""/>
+      <w:lvlJc w:val="left"/>
+      <w:pPr>
+        <w:ind w:left="3240" w:hanging="360"/>
+      </w:pPr>
+      <w:rPr>
+        <w:rFonts w:ascii="Symbol" w:hAnsi="Symbol" w:hint="default"/>
+      </w:rPr>
+    </w:lvl>
+    <w:lvl w:ilvl="4" w:tplc="040C0003" w:tentative="1">
+      <w:start w:val="1"/>
+      <w:numFmt w:val="bullet"/>
+      <w:lvlText w:val="o"/>
+      <w:lvlJc w:val="left"/>
+      <w:pPr>
+        <w:ind w:left="3960" w:hanging="360"/>
+      </w:pPr>
+      <w:rPr>
+        <w:rFonts w:ascii="Courier New" w:hAnsi="Courier New" w:cs="Courier New" w:hint="default"/>
+      </w:rPr>
+    </w:lvl>
+    <w:lvl w:ilvl="5" w:tplc="040C0005" w:tentative="1">
+      <w:start w:val="1"/>
+      <w:numFmt w:val="bullet"/>
+      <w:lvlText w:val=""/>
+      <w:lvlJc w:val="left"/>
+      <w:pPr>
+        <w:ind w:left="4680" w:hanging="360"/>
+      </w:pPr>
+      <w:rPr>
+        <w:rFonts w:ascii="Wingdings" w:hAnsi="Wingdings" w:hint="default"/>
+      </w:rPr>
+    </w:lvl>
+    <w:lvl w:ilvl="6" w:tplc="040C0001" w:tentative="1">
+      <w:start w:val="1"/>
+      <w:numFmt w:val="bullet"/>
+      <w:lvlText w:val=""/>
+      <w:lvlJc w:val="left"/>
+      <w:pPr>
+        <w:ind w:left="5400" w:hanging="360"/>
+      </w:pPr>
+      <w:rPr>
+        <w:rFonts w:ascii="Symbol" w:hAnsi="Symbol" w:hint="default"/>
+      </w:rPr>
+    </w:lvl>
+    <w:lvl w:ilvl="7" w:tplc="040C0003" w:tentative="1">
+      <w:start w:val="1"/>
+      <w:numFmt w:val="bullet"/>
+      <w:lvlText w:val="o"/>
+      <w:lvlJc w:val="left"/>
+      <w:pPr>
+        <w:ind w:left="6120" w:hanging="360"/>
+      </w:pPr>
+      <w:rPr>
+        <w:rFonts w:ascii="Courier New" w:hAnsi="Courier New" w:cs="Courier New" w:hint="default"/>
+      </w:rPr>
+    </w:lvl>
+    <w:lvl w:ilvl="8" w:tplc="040C0005" w:tentative="1">
+      <w:start w:val="1"/>
+      <w:numFmt w:val="bullet"/>
+      <w:lvlText w:val=""/>
+      <w:lvlJc w:val="left"/>
+      <w:pPr>
+        <w:ind w:left="6840" w:hanging="360"/>
+      </w:pPr>
+      <w:rPr>
+        <w:rFonts w:ascii="Wingdings" w:hAnsi="Wingdings" w:hint="default"/>
+      </w:rPr>
+    </w:lvl>
+  </w:abstractNum>
+  <w:abstractNum w:abstractNumId="14" w15:restartNumberingAfterBreak="0">
     <w:nsid w:val="5FD66ED1"/>
     <w:multiLevelType w:val="hybridMultilevel"/>
     <w:tmpl w:val="6F0482EA"/>
@@ -1949,7 +3345,305 @@
       </w:rPr>
     </w:lvl>
   </w:abstractNum>
-  <w:abstractNum w:abstractNumId="9" w15:restartNumberingAfterBreak="0">
+  <w:abstractNum w:abstractNumId="15" w15:restartNumberingAfterBreak="0">
+    <w:nsid w:val="614025C0"/>
+    <w:multiLevelType w:val="multilevel"/>
+    <w:tmpl w:val="E2F43A0A"/>
+    <w:lvl w:ilvl="0">
+      <w:start w:val="1"/>
+      <w:numFmt w:val="bullet"/>
+      <w:lvlText w:val=""/>
+      <w:lvlJc w:val="left"/>
+      <w:pPr>
+        <w:tabs>
+          <w:tab w:val="num" w:pos="720"/>
+        </w:tabs>
+        <w:ind w:left="720" w:hanging="360"/>
+      </w:pPr>
+      <w:rPr>
+        <w:rFonts w:ascii="Symbol" w:hAnsi="Symbol" w:hint="default"/>
+        <w:sz w:val="20"/>
+      </w:rPr>
+    </w:lvl>
+    <w:lvl w:ilvl="1" w:tentative="1">
+      <w:start w:val="1"/>
+      <w:numFmt w:val="bullet"/>
+      <w:lvlText w:val="o"/>
+      <w:lvlJc w:val="left"/>
+      <w:pPr>
+        <w:tabs>
+          <w:tab w:val="num" w:pos="1440"/>
+        </w:tabs>
+        <w:ind w:left="1440" w:hanging="360"/>
+      </w:pPr>
+      <w:rPr>
+        <w:rFonts w:ascii="Courier New" w:hAnsi="Courier New" w:hint="default"/>
+        <w:sz w:val="20"/>
+      </w:rPr>
+    </w:lvl>
+    <w:lvl w:ilvl="2" w:tentative="1">
+      <w:start w:val="1"/>
+      <w:numFmt w:val="bullet"/>
+      <w:lvlText w:val=""/>
+      <w:lvlJc w:val="left"/>
+      <w:pPr>
+        <w:tabs>
+          <w:tab w:val="num" w:pos="2160"/>
+        </w:tabs>
+        <w:ind w:left="2160" w:hanging="360"/>
+      </w:pPr>
+      <w:rPr>
+        <w:rFonts w:ascii="Wingdings" w:hAnsi="Wingdings" w:hint="default"/>
+        <w:sz w:val="20"/>
+      </w:rPr>
+    </w:lvl>
+    <w:lvl w:ilvl="3" w:tentative="1">
+      <w:start w:val="1"/>
+      <w:numFmt w:val="bullet"/>
+      <w:lvlText w:val=""/>
+      <w:lvlJc w:val="left"/>
+      <w:pPr>
+        <w:tabs>
+          <w:tab w:val="num" w:pos="2880"/>
+        </w:tabs>
+        <w:ind w:left="2880" w:hanging="360"/>
+      </w:pPr>
+      <w:rPr>
+        <w:rFonts w:ascii="Wingdings" w:hAnsi="Wingdings" w:hint="default"/>
+        <w:sz w:val="20"/>
+      </w:rPr>
+    </w:lvl>
+    <w:lvl w:ilvl="4" w:tentative="1">
+      <w:start w:val="1"/>
+      <w:numFmt w:val="bullet"/>
+      <w:lvlText w:val=""/>
+      <w:lvlJc w:val="left"/>
+      <w:pPr>
+        <w:tabs>
+          <w:tab w:val="num" w:pos="3600"/>
+        </w:tabs>
+        <w:ind w:left="3600" w:hanging="360"/>
+      </w:pPr>
+      <w:rPr>
+        <w:rFonts w:ascii="Wingdings" w:hAnsi="Wingdings" w:hint="default"/>
+        <w:sz w:val="20"/>
+      </w:rPr>
+    </w:lvl>
+    <w:lvl w:ilvl="5" w:tentative="1">
+      <w:start w:val="1"/>
+      <w:numFmt w:val="bullet"/>
+      <w:lvlText w:val=""/>
+      <w:lvlJc w:val="left"/>
+      <w:pPr>
+        <w:tabs>
+          <w:tab w:val="num" w:pos="4320"/>
+        </w:tabs>
+        <w:ind w:left="4320" w:hanging="360"/>
+      </w:pPr>
+      <w:rPr>
+        <w:rFonts w:ascii="Wingdings" w:hAnsi="Wingdings" w:hint="default"/>
+        <w:sz w:val="20"/>
+      </w:rPr>
+    </w:lvl>
+    <w:lvl w:ilvl="6" w:tentative="1">
+      <w:start w:val="1"/>
+      <w:numFmt w:val="bullet"/>
+      <w:lvlText w:val=""/>
+      <w:lvlJc w:val="left"/>
+      <w:pPr>
+        <w:tabs>
+          <w:tab w:val="num" w:pos="5040"/>
+        </w:tabs>
+        <w:ind w:left="5040" w:hanging="360"/>
+      </w:pPr>
+      <w:rPr>
+        <w:rFonts w:ascii="Wingdings" w:hAnsi="Wingdings" w:hint="default"/>
+        <w:sz w:val="20"/>
+      </w:rPr>
+    </w:lvl>
+    <w:lvl w:ilvl="7" w:tentative="1">
+      <w:start w:val="1"/>
+      <w:numFmt w:val="bullet"/>
+      <w:lvlText w:val=""/>
+      <w:lvlJc w:val="left"/>
+      <w:pPr>
+        <w:tabs>
+          <w:tab w:val="num" w:pos="5760"/>
+        </w:tabs>
+        <w:ind w:left="5760" w:hanging="360"/>
+      </w:pPr>
+      <w:rPr>
+        <w:rFonts w:ascii="Wingdings" w:hAnsi="Wingdings" w:hint="default"/>
+        <w:sz w:val="20"/>
+      </w:rPr>
+    </w:lvl>
+    <w:lvl w:ilvl="8" w:tentative="1">
+      <w:start w:val="1"/>
+      <w:numFmt w:val="bullet"/>
+      <w:lvlText w:val=""/>
+      <w:lvlJc w:val="left"/>
+      <w:pPr>
+        <w:tabs>
+          <w:tab w:val="num" w:pos="6480"/>
+        </w:tabs>
+        <w:ind w:left="6480" w:hanging="360"/>
+      </w:pPr>
+      <w:rPr>
+        <w:rFonts w:ascii="Wingdings" w:hAnsi="Wingdings" w:hint="default"/>
+        <w:sz w:val="20"/>
+      </w:rPr>
+    </w:lvl>
+  </w:abstractNum>
+  <w:abstractNum w:abstractNumId="16" w15:restartNumberingAfterBreak="0">
+    <w:nsid w:val="62744AE6"/>
+    <w:multiLevelType w:val="multilevel"/>
+    <w:tmpl w:val="412A6BC8"/>
+    <w:lvl w:ilvl="0">
+      <w:start w:val="1"/>
+      <w:numFmt w:val="bullet"/>
+      <w:lvlText w:val=""/>
+      <w:lvlJc w:val="left"/>
+      <w:pPr>
+        <w:tabs>
+          <w:tab w:val="num" w:pos="720"/>
+        </w:tabs>
+        <w:ind w:left="720" w:hanging="360"/>
+      </w:pPr>
+      <w:rPr>
+        <w:rFonts w:ascii="Symbol" w:hAnsi="Symbol" w:hint="default"/>
+        <w:sz w:val="20"/>
+      </w:rPr>
+    </w:lvl>
+    <w:lvl w:ilvl="1" w:tentative="1">
+      <w:start w:val="1"/>
+      <w:numFmt w:val="bullet"/>
+      <w:lvlText w:val="o"/>
+      <w:lvlJc w:val="left"/>
+      <w:pPr>
+        <w:tabs>
+          <w:tab w:val="num" w:pos="1440"/>
+        </w:tabs>
+        <w:ind w:left="1440" w:hanging="360"/>
+      </w:pPr>
+      <w:rPr>
+        <w:rFonts w:ascii="Courier New" w:hAnsi="Courier New" w:hint="default"/>
+        <w:sz w:val="20"/>
+      </w:rPr>
+    </w:lvl>
+    <w:lvl w:ilvl="2" w:tentative="1">
+      <w:start w:val="1"/>
+      <w:numFmt w:val="bullet"/>
+      <w:lvlText w:val=""/>
+      <w:lvlJc w:val="left"/>
+      <w:pPr>
+        <w:tabs>
+          <w:tab w:val="num" w:pos="2160"/>
+        </w:tabs>
+        <w:ind w:left="2160" w:hanging="360"/>
+      </w:pPr>
+      <w:rPr>
+        <w:rFonts w:ascii="Wingdings" w:hAnsi="Wingdings" w:hint="default"/>
+        <w:sz w:val="20"/>
+      </w:rPr>
+    </w:lvl>
+    <w:lvl w:ilvl="3" w:tentative="1">
+      <w:start w:val="1"/>
+      <w:numFmt w:val="bullet"/>
+      <w:lvlText w:val=""/>
+      <w:lvlJc w:val="left"/>
+      <w:pPr>
+        <w:tabs>
+          <w:tab w:val="num" w:pos="2880"/>
+        </w:tabs>
+        <w:ind w:left="2880" w:hanging="360"/>
+      </w:pPr>
+      <w:rPr>
+        <w:rFonts w:ascii="Wingdings" w:hAnsi="Wingdings" w:hint="default"/>
+        <w:sz w:val="20"/>
+      </w:rPr>
+    </w:lvl>
+    <w:lvl w:ilvl="4" w:tentative="1">
+      <w:start w:val="1"/>
+      <w:numFmt w:val="bullet"/>
+      <w:lvlText w:val=""/>
+      <w:lvlJc w:val="left"/>
+      <w:pPr>
+        <w:tabs>
+          <w:tab w:val="num" w:pos="3600"/>
+        </w:tabs>
+        <w:ind w:left="3600" w:hanging="360"/>
+      </w:pPr>
+      <w:rPr>
+        <w:rFonts w:ascii="Wingdings" w:hAnsi="Wingdings" w:hint="default"/>
+        <w:sz w:val="20"/>
+      </w:rPr>
+    </w:lvl>
+    <w:lvl w:ilvl="5" w:tentative="1">
+      <w:start w:val="1"/>
+      <w:numFmt w:val="bullet"/>
+      <w:lvlText w:val=""/>
+      <w:lvlJc w:val="left"/>
+      <w:pPr>
+        <w:tabs>
+          <w:tab w:val="num" w:pos="4320"/>
+        </w:tabs>
+        <w:ind w:left="4320" w:hanging="360"/>
+      </w:pPr>
+      <w:rPr>
+        <w:rFonts w:ascii="Wingdings" w:hAnsi="Wingdings" w:hint="default"/>
+        <w:sz w:val="20"/>
+      </w:rPr>
+    </w:lvl>
+    <w:lvl w:ilvl="6" w:tentative="1">
+      <w:start w:val="1"/>
+      <w:numFmt w:val="bullet"/>
+      <w:lvlText w:val=""/>
+      <w:lvlJc w:val="left"/>
+      <w:pPr>
+        <w:tabs>
+          <w:tab w:val="num" w:pos="5040"/>
+        </w:tabs>
+        <w:ind w:left="5040" w:hanging="360"/>
+      </w:pPr>
+      <w:rPr>
+        <w:rFonts w:ascii="Wingdings" w:hAnsi="Wingdings" w:hint="default"/>
+        <w:sz w:val="20"/>
+      </w:rPr>
+    </w:lvl>
+    <w:lvl w:ilvl="7" w:tentative="1">
+      <w:start w:val="1"/>
+      <w:numFmt w:val="bullet"/>
+      <w:lvlText w:val=""/>
+      <w:lvlJc w:val="left"/>
+      <w:pPr>
+        <w:tabs>
+          <w:tab w:val="num" w:pos="5760"/>
+        </w:tabs>
+        <w:ind w:left="5760" w:hanging="360"/>
+      </w:pPr>
+      <w:rPr>
+        <w:rFonts w:ascii="Wingdings" w:hAnsi="Wingdings" w:hint="default"/>
+        <w:sz w:val="20"/>
+      </w:rPr>
+    </w:lvl>
+    <w:lvl w:ilvl="8" w:tentative="1">
+      <w:start w:val="1"/>
+      <w:numFmt w:val="bullet"/>
+      <w:lvlText w:val=""/>
+      <w:lvlJc w:val="left"/>
+      <w:pPr>
+        <w:tabs>
+          <w:tab w:val="num" w:pos="6480"/>
+        </w:tabs>
+        <w:ind w:left="6480" w:hanging="360"/>
+      </w:pPr>
+      <w:rPr>
+        <w:rFonts w:ascii="Wingdings" w:hAnsi="Wingdings" w:hint="default"/>
+        <w:sz w:val="20"/>
+      </w:rPr>
+    </w:lvl>
+  </w:abstractNum>
+  <w:abstractNum w:abstractNumId="17" w15:restartNumberingAfterBreak="0">
     <w:nsid w:val="65400F37"/>
     <w:multiLevelType w:val="hybridMultilevel"/>
     <w:tmpl w:val="A2DEB322"/>
@@ -2062,7 +3756,7 @@
       </w:rPr>
     </w:lvl>
   </w:abstractNum>
-  <w:abstractNum w:abstractNumId="10" w15:restartNumberingAfterBreak="0">
+  <w:abstractNum w:abstractNumId="18" w15:restartNumberingAfterBreak="0">
     <w:nsid w:val="6AD41C46"/>
     <w:multiLevelType w:val="hybridMultilevel"/>
     <w:tmpl w:val="CECAB9E0"/>
@@ -2175,7 +3869,7 @@
       </w:rPr>
     </w:lvl>
   </w:abstractNum>
-  <w:abstractNum w:abstractNumId="11" w15:restartNumberingAfterBreak="0">
+  <w:abstractNum w:abstractNumId="19" w15:restartNumberingAfterBreak="0">
     <w:nsid w:val="6D09448B"/>
     <w:multiLevelType w:val="hybridMultilevel"/>
     <w:tmpl w:val="20608616"/>
@@ -2288,7 +3982,7 @@
       </w:rPr>
     </w:lvl>
   </w:abstractNum>
-  <w:abstractNum w:abstractNumId="12" w15:restartNumberingAfterBreak="0">
+  <w:abstractNum w:abstractNumId="20" w15:restartNumberingAfterBreak="0">
     <w:nsid w:val="75644934"/>
     <w:multiLevelType w:val="hybridMultilevel"/>
     <w:tmpl w:val="120A6980"/>
@@ -2402,43 +4096,67 @@
     </w:lvl>
   </w:abstractNum>
   <w:num w:numId="1" w16cid:durableId="247158278">
+    <w:abstractNumId w:val="18"/>
+  </w:num>
+  <w:num w:numId="2" w16cid:durableId="303586041">
+    <w:abstractNumId w:val="12"/>
+  </w:num>
+  <w:num w:numId="3" w16cid:durableId="1562786819">
+    <w:abstractNumId w:val="2"/>
+  </w:num>
+  <w:num w:numId="4" w16cid:durableId="806506357">
+    <w:abstractNumId w:val="20"/>
+  </w:num>
+  <w:num w:numId="5" w16cid:durableId="572155609">
+    <w:abstractNumId w:val="14"/>
+  </w:num>
+  <w:num w:numId="6" w16cid:durableId="1158420145">
+    <w:abstractNumId w:val="11"/>
+  </w:num>
+  <w:num w:numId="7" w16cid:durableId="95489964">
+    <w:abstractNumId w:val="19"/>
+  </w:num>
+  <w:num w:numId="8" w16cid:durableId="922488947">
+    <w:abstractNumId w:val="9"/>
+  </w:num>
+  <w:num w:numId="9" w16cid:durableId="909970071">
+    <w:abstractNumId w:val="17"/>
+  </w:num>
+  <w:num w:numId="10" w16cid:durableId="99496583">
+    <w:abstractNumId w:val="8"/>
+  </w:num>
+  <w:num w:numId="11" w16cid:durableId="1628395412">
+    <w:abstractNumId w:val="5"/>
+  </w:num>
+  <w:num w:numId="12" w16cid:durableId="855921292">
+    <w:abstractNumId w:val="6"/>
+  </w:num>
+  <w:num w:numId="13" w16cid:durableId="1545558422">
+    <w:abstractNumId w:val="7"/>
+  </w:num>
+  <w:num w:numId="14" w16cid:durableId="1841505078">
+    <w:abstractNumId w:val="15"/>
+  </w:num>
+  <w:num w:numId="15" w16cid:durableId="1622226955">
+    <w:abstractNumId w:val="0"/>
+  </w:num>
+  <w:num w:numId="16" w16cid:durableId="988170578">
+    <w:abstractNumId w:val="4"/>
+  </w:num>
+  <w:num w:numId="17" w16cid:durableId="863320619">
     <w:abstractNumId w:val="10"/>
   </w:num>
-  <w:num w:numId="2" w16cid:durableId="303586041">
-    <w:abstractNumId w:val="7"/>
+  <w:num w:numId="18" w16cid:durableId="620305117">
+    <w:abstractNumId w:val="13"/>
   </w:num>
-  <w:num w:numId="3" w16cid:durableId="1562786819">
-    <w:abstractNumId w:val="0"/>
+  <w:num w:numId="19" w16cid:durableId="756438394">
+    <w:abstractNumId w:val="3"/>
   </w:num>
-  <w:num w:numId="4" w16cid:durableId="806506357">
-    <w:abstractNumId w:val="12"/>
+  <w:num w:numId="20" w16cid:durableId="833497404">
+    <w:abstractNumId w:val="16"/>
   </w:num>
-  <w:num w:numId="5" w16cid:durableId="572155609">
-    <w:abstractNumId w:val="8"/>
-  </w:num>
-  <w:num w:numId="6" w16cid:durableId="1158420145">
-    <w:abstractNumId w:val="6"/>
-  </w:num>
-  <w:num w:numId="7" w16cid:durableId="95489964">
-    <w:abstractNumId w:val="11"/>
-  </w:num>
-  <w:num w:numId="8" w16cid:durableId="922488947">
-    <w:abstractNumId w:val="5"/>
-  </w:num>
-  <w:num w:numId="9" w16cid:durableId="909970071">
-    <w:abstractNumId w:val="9"/>
-  </w:num>
-  <w:num w:numId="10" w16cid:durableId="99496583">
-    <w:abstractNumId w:val="4"/>
-  </w:num>
-  <w:num w:numId="11" w16cid:durableId="1628395412">
+  <w:num w:numId="21" w16cid:durableId="736317558">
     <w:abstractNumId w:val="1"/>
-  </w:num>
-  <w:num w:numId="12" w16cid:durableId="855921292">
-    <w:abstractNumId w:val="2"/>
-  </w:num>
-  <w:num w:numId="13" w16cid:durableId="1545558422">
-    <w:abstractNumId w:val="3"/>
   </w:num>
 </w:numbering>
 </file>
@@ -3045,6 +4763,7 @@
   <w:style w:type="character" w:default="1" w:styleId="Policepardfaut">
     <w:name w:val="Default Paragraph Font"/>
     <w:uiPriority w:val="1"/>
+    <w:semiHidden/>
     <w:unhideWhenUsed/>
   </w:style>
   <w:style w:type="table" w:default="1" w:styleId="TableauNormal">
@@ -3355,6 +5074,57 @@
       <w:smallCaps/>
       <w:color w:val="0F4761" w:themeColor="accent1" w:themeShade="BF"/>
       <w:spacing w:val="5"/>
+    </w:rPr>
+  </w:style>
+  <w:style w:type="character" w:styleId="Lienhypertexte">
+    <w:name w:val="Hyperlink"/>
+    <w:basedOn w:val="Policepardfaut"/>
+    <w:uiPriority w:val="99"/>
+    <w:unhideWhenUsed/>
+    <w:rsid w:val="007A4CB9"/>
+    <w:rPr>
+      <w:color w:val="467886" w:themeColor="hyperlink"/>
+      <w:u w:val="single"/>
+    </w:rPr>
+  </w:style>
+  <w:style w:type="character" w:styleId="Mentionnonrsolue">
+    <w:name w:val="Unresolved Mention"/>
+    <w:basedOn w:val="Policepardfaut"/>
+    <w:uiPriority w:val="99"/>
+    <w:semiHidden/>
+    <w:unhideWhenUsed/>
+    <w:rsid w:val="007A4CB9"/>
+    <w:rPr>
+      <w:color w:val="605E5C"/>
+      <w:shd w:val="clear" w:color="auto" w:fill="E1DFDD"/>
+    </w:rPr>
+  </w:style>
+  <w:style w:type="paragraph" w:styleId="NormalWeb">
+    <w:name w:val="Normal (Web)"/>
+    <w:basedOn w:val="Normal"/>
+    <w:uiPriority w:val="99"/>
+    <w:semiHidden/>
+    <w:unhideWhenUsed/>
+    <w:rsid w:val="007A4CB9"/>
+    <w:pPr>
+      <w:spacing w:before="100" w:beforeAutospacing="1" w:after="100" w:afterAutospacing="1" w:line="240" w:lineRule="auto"/>
+    </w:pPr>
+    <w:rPr>
+      <w:rFonts w:ascii="Times New Roman" w:eastAsia="Times New Roman" w:hAnsi="Times New Roman" w:cs="Times New Roman"/>
+      <w:kern w:val="0"/>
+      <w:lang w:eastAsia="fr-FR"/>
+      <w14:ligatures w14:val="none"/>
+    </w:rPr>
+  </w:style>
+  <w:style w:type="character" w:styleId="lev">
+    <w:name w:val="Strong"/>
+    <w:basedOn w:val="Policepardfaut"/>
+    <w:uiPriority w:val="22"/>
+    <w:qFormat/>
+    <w:rsid w:val="007A4CB9"/>
+    <w:rPr>
+      <w:b/>
+      <w:bCs/>
     </w:rPr>
   </w:style>
 </w:styles>

</xml_diff>